<commit_message>
style(docs): add dynamic page numbering and dual-column footer layout
</commit_message>
<xml_diff>
--- a/Modul_Meta_Ads_dan_AI_Agent_Automation.docx
+++ b/Modul_Meta_Ads_dan_AI_Agent_Automation.docx
@@ -5028,6 +5028,7 @@
       <w:pgSz w:w="12240" w:h="15840"/>
       <w:pgMar w:top="1152" w:right="1152" w:bottom="1152" w:left="1152" w:header="720" w:footer="720" w:gutter="0"/>
       <w:cols w:space="720"/>
+      <w:titlePg/>
       <w:docGrid w:linePitch="360"/>
     </w:sectPr>
   </w:body>
@@ -5039,17 +5040,99 @@
   <w:p>
     <w:pPr>
       <w:pStyle w:val="Footer"/>
-      <w:jc w:val="right"/>
     </w:pPr>
-    <w:r>
-      <w:rPr>
-        <w:rFonts w:ascii="Calibri" w:hAnsi="Calibri"/>
-        <w:color w:val="94A3B8"/>
-        <w:sz w:val="17"/>
-      </w:rPr>
-      <w:t>syahmiaof.my | Pasukan Orkestrasi Ejen AI DFK INC</w:t>
-    </w:r>
+    <w:r/>
   </w:p>
+  <w:tbl>
+    <w:tblPr>
+      <w:tblW w:type="auto" w:w="0"/>
+      <w:jc w:val="center"/>
+      <w:tblLook w:firstColumn="1" w:firstRow="1" w:lastColumn="0" w:lastRow="0" w:noHBand="0" w:noVBand="1" w:val="04A0"/>
+      <w:tblBorders>
+        <w:top w:val="single" w:sz="4" w:space="0" w:color="E2E8F0"/>
+        <w:left w:val="none"/>
+        <w:bottom w:val="none"/>
+        <w:right w:val="none"/>
+        <w:insideH w:val="none"/>
+        <w:insideV w:val="none"/>
+      </w:tblBorders>
+    </w:tblPr>
+    <w:tblGrid>
+      <w:gridCol w:w="4968"/>
+      <w:gridCol w:w="4968"/>
+    </w:tblGrid>
+    <w:tr>
+      <w:tc>
+        <w:tcPr>
+          <w:tcW w:type="dxa" w:w="6480"/>
+        </w:tcPr>
+        <w:p>
+          <w:pPr>
+            <w:spacing w:before="80" w:after="0"/>
+          </w:pPr>
+          <w:r>
+            <w:rPr>
+              <w:rFonts w:ascii="Calibri" w:hAnsi="Calibri"/>
+              <w:color w:val="94A3B8"/>
+              <w:sz w:val="17"/>
+            </w:rPr>
+            <w:t>Modul Meta Ads &amp; AI Agent Automation | Muhammad Syahmi (syahmiaof)</w:t>
+          </w:r>
+        </w:p>
+      </w:tc>
+      <w:tc>
+        <w:tcPr>
+          <w:tcW w:type="dxa" w:w="3456"/>
+        </w:tcPr>
+        <w:p>
+          <w:pPr>
+            <w:spacing w:before="80" w:after="0"/>
+            <w:jc w:val="right"/>
+          </w:pPr>
+          <w:r>
+            <w:rPr>
+              <w:rFonts w:ascii="Calibri" w:hAnsi="Calibri"/>
+              <w:color w:val="94A3B8"/>
+              <w:sz w:val="17"/>
+            </w:rPr>
+            <w:t xml:space="preserve">Muka Surat </w:t>
+          </w:r>
+          <w:r>
+            <w:rPr>
+              <w:rFonts w:ascii="Calibri" w:hAnsi="Calibri"/>
+              <w:color w:val="94A3B8"/>
+              <w:sz w:val="17"/>
+            </w:rPr>
+            <w:fldChar w:fldCharType="begin"/>
+            <w:instrText xml:space="preserve"> PAGE </w:instrText>
+            <w:fldChar w:fldCharType="separate"/>
+            <w:t>1</w:t>
+            <w:fldChar w:fldCharType="end"/>
+          </w:r>
+          <w:r>
+            <w:rPr>
+              <w:rFonts w:ascii="Calibri" w:hAnsi="Calibri"/>
+              <w:color w:val="94A3B8"/>
+              <w:sz w:val="17"/>
+            </w:rPr>
+            <w:t xml:space="preserve"> daripada </w:t>
+          </w:r>
+          <w:r>
+            <w:rPr>
+              <w:rFonts w:ascii="Calibri" w:hAnsi="Calibri"/>
+              <w:color w:val="94A3B8"/>
+              <w:sz w:val="17"/>
+            </w:rPr>
+            <w:fldChar w:fldCharType="begin"/>
+            <w:instrText xml:space="preserve"> NUMPAGES </w:instrText>
+            <w:fldChar w:fldCharType="separate"/>
+            <w:t>1</w:t>
+            <w:fldChar w:fldCharType="end"/>
+          </w:r>
+        </w:p>
+      </w:tc>
+    </w:tr>
+  </w:tbl>
 </w:ftr>
 </file>
 
@@ -5066,7 +5149,7 @@
         <w:color w:val="94A3B8"/>
         <w:sz w:val="17"/>
       </w:rPr>
-      <w:t>Modul Ebook: Meta Ads &amp; AI Agent Automation</w:t>
+      <w:t>Modul Ebook Lengkap: Meta Ads &amp; AI Agent Automation</w:t>
     </w:r>
   </w:p>
 </w:hdr>

</xml_diff>